<commit_message>
changes made in project report
</commit_message>
<xml_diff>
--- a/docs/reports/Flight_Controller_Report_00.docx
+++ b/docs/reports/Flight_Controller_Report_00.docx
@@ -194,7 +194,7 @@
           <w:sz w:val="32"/>
           <w:szCs w:val="32"/>
         </w:rPr>
-        <w:t>Project Supervisor/(s):</w:t>
+        <w:t>Project Supervisor:</w:t>
       </w:r>
     </w:p>
     <w:p>
@@ -406,7 +406,10 @@
         <w:jc w:val="both"/>
       </w:pPr>
       <w:r>
-        <w:t xml:space="preserve">     Roll No.</w:t>
+        <w:t xml:space="preserve">     </w:t>
+      </w:r>
+      <w:r>
+        <w:t>Name</w:t>
       </w:r>
       <w:r>
         <w:tab/>
@@ -418,8 +421,10 @@
         <w:tab/>
       </w:r>
       <w:r>
+        <w:t xml:space="preserve">         Roll No.</w:t>
+      </w:r>
+      <w:r>
         <w:tab/>
-        <w:t>Name</w:t>
       </w:r>
       <w:r>
         <w:tab/>
@@ -434,7 +439,9 @@
         <w:tab/>
       </w:r>
       <w:r>
-        <w:tab/>
+        <w:t xml:space="preserve">     </w:t>
+      </w:r>
+      <w:r>
         <w:t>Signature</w:t>
       </w:r>
     </w:p>
@@ -2387,7 +2394,13 @@
         <w:jc w:val="both"/>
       </w:pPr>
       <w:r>
-        <w:t>The proposed flight controller integrates essential hardware required for modern UAV systems. These include the ICM-40609-D Inertial Measurement Unit (IMU) for measuring acceleration and angular velocity, the MMC5983MA Magnetometer for heading estimation, and the BMP390 Barometric Pressure Sensor for altitude measurement. The controller also incorporates USB Type-C connectivity, SWD debugging interface, SD card interface, ESC outputs, telemetry connectors, GPS interface, RC receiver interface, RGB status LED, buzzer circuit, and a dedicated power management section consisting of a buck converter, power multiplexer, and low-dropout voltage regulator.</w:t>
+        <w:t xml:space="preserve">The proposed flight controller integrates essential hardware required for modern UAV systems. These include the ICM-40609-D Inertial Measurement Unit (IMU) for measuring acceleration and angular velocity, the MMC5983MA Magnetometer for heading estimation, and the </w:t>
+      </w:r>
+      <w:r>
+        <w:t>BMP390L</w:t>
+      </w:r>
+      <w:r>
+        <w:t xml:space="preserve"> Barometric Pressure Sensor for altitude measurement. The controller also incorporates USB Type-C connectivity, SWD debugging interface, SD card interface, ESC outputs, telemetry connectors, GPS interface, RC receiver interface, RGB status LED, buzzer circuit, and a dedicated power management section consisting of a buck converter, power multiplexer, and low-dropout voltage regulator.</w:t>
       </w:r>
     </w:p>
     <w:p>
@@ -5799,7 +5812,19 @@
         <w:rPr>
           <w:color w:val="000000"/>
         </w:rPr>
-        <w:t>Integration of the ICM40609DIMU, MMC5983MA magnetometer, and BMP390 barometer.</w:t>
+        <w:t xml:space="preserve">Integration of the ICM40609DIMU, MMC5983MA magnetometer, and </w:t>
+      </w:r>
+      <w:r>
+        <w:rPr>
+          <w:color w:val="000000"/>
+        </w:rPr>
+        <w:t>BMP390L</w:t>
+      </w:r>
+      <w:r>
+        <w:rPr>
+          <w:color w:val="000000"/>
+        </w:rPr>
+        <w:t xml:space="preserve"> barometer.</w:t>
       </w:r>
     </w:p>
     <w:p>
@@ -6332,7 +6357,13 @@
         <w:rPr>
           <w:color w:val="000000"/>
         </w:rPr>
-        <w:t>BMP390 Digital Barometric Pressure Sensor</w:t>
+        <w:t>BMP390L</w:t>
+      </w:r>
+      <w:r>
+        <w:rPr>
+          <w:color w:val="000000"/>
+        </w:rPr>
+        <w:t xml:space="preserve"> Digital Barometric Pressure Sensor</w:t>
       </w:r>
     </w:p>
     <w:p>
@@ -7370,7 +7401,7 @@
               <w:rPr>
                 <w:color w:val="000000"/>
               </w:rPr>
-              <w:t>BMP390</w:t>
+              <w:t>BMP390L</w:t>
             </w:r>
           </w:p>
         </w:tc>
@@ -8059,7 +8090,7 @@
               <w:rPr>
                 <w:color w:val="000000"/>
               </w:rPr>
-              <w:t>BMP390</w:t>
+              <w:t>BMP390L</w:t>
             </w:r>
           </w:p>
         </w:tc>
@@ -9062,7 +9093,10 @@
         <w:spacing w:before="200" w:after="100"/>
       </w:pPr>
       <w:r>
-        <w:t>BMP390 Barometer</w:t>
+        <w:t>BMP390L</w:t>
+      </w:r>
+      <w:r>
+        <w:t xml:space="preserve"> Barometer</w:t>
       </w:r>
     </w:p>
     <w:p>
@@ -9071,7 +9105,13 @@
         <w:jc w:val="both"/>
       </w:pPr>
       <w:r>
-        <w:t>The BMP390 measures atmospheric pressure and temperature. Communication Protocol: I²C. Purpose: Altitude estimation, vertical positioning.</w:t>
+        <w:t xml:space="preserve">The </w:t>
+      </w:r>
+      <w:r>
+        <w:t>BMP390L</w:t>
+      </w:r>
+      <w:r>
+        <w:t xml:space="preserve"> measures atmospheric pressure and temperature. Communication Protocol: I²C. Purpose: Altitude estimation, vertical positioning.</w:t>
       </w:r>
     </w:p>
     <w:p>
@@ -10150,7 +10190,13 @@
               <w:rPr>
                 <w:color w:val="000000"/>
               </w:rPr>
-              <w:t>BMP390 Communication</w:t>
+              <w:t>BMP390L</w:t>
+            </w:r>
+            <w:r>
+              <w:rPr>
+                <w:color w:val="000000"/>
+              </w:rPr>
+              <w:t xml:space="preserve"> Communication</w:t>
             </w:r>
           </w:p>
         </w:tc>
@@ -11306,7 +11352,13 @@
         <w:rPr>
           <w:color w:val="000000"/>
         </w:rPr>
-        <w:t>I²C interface for the BMP390</w:t>
+        <w:t xml:space="preserve">I²C interface for the </w:t>
+      </w:r>
+      <w:r>
+        <w:rPr>
+          <w:color w:val="000000"/>
+        </w:rPr>
+        <w:t>BMP390L</w:t>
       </w:r>
     </w:p>
     <w:p>
@@ -12946,7 +12998,13 @@
         <w:jc w:val="both"/>
       </w:pPr>
       <w:r>
-        <w:t>A complete schematic of the flight controller was successfully designed using Proteus Design Suite. The schematic integrates the STM32CUBEMX microcontroller with the essential hardware required for a modern flight controller, including the ICM40609DInertial Measurement Unit (IMU), MMC5983MA magnetometer, BMP390 barometric pressure sensor, USB Type-C interface, SWD debugging interface, SD card interface, GPS connector, telemetry connector, RC receiver connector, ESC outputs, RGB status LED, buzzer, and power management circuitry. The modular organisation of the schematic into separate functional sections improves readability, simplifies future modifications, and facilitates debugging.</w:t>
+        <w:t xml:space="preserve">A complete schematic of the flight controller was successfully designed using Proteus Design Suite. The schematic integrates the STM32CUBEMX microcontroller with the essential hardware required for a modern flight controller, including the ICM40609DInertial Measurement Unit (IMU), MMC5983MA magnetometer, </w:t>
+      </w:r>
+      <w:r>
+        <w:t>BMP390L</w:t>
+      </w:r>
+      <w:r>
+        <w:t xml:space="preserve"> barometric pressure sensor, USB Type-C interface, SWD debugging interface, SD card interface, GPS connector, telemetry connector, RC receiver connector, ESC outputs, RGB status LED, buzzer, and power management circuitry. The modular organisation of the schematic into separate functional sections improves readability, simplifies future modifications, and facilitates debugging.</w:t>
       </w:r>
     </w:p>
     <w:p>
@@ -14150,7 +14208,19 @@
         <w:rPr>
           <w:color w:val="000000"/>
         </w:rPr>
-        <w:t xml:space="preserve">, "BMP390 Digital Pressure Sensor Datasheet," Bosch </w:t>
+        <w:t>, "</w:t>
+      </w:r>
+      <w:r>
+        <w:rPr>
+          <w:color w:val="000000"/>
+        </w:rPr>
+        <w:t>BMP390L</w:t>
+      </w:r>
+      <w:r>
+        <w:rPr>
+          <w:color w:val="000000"/>
+        </w:rPr>
+        <w:t xml:space="preserve"> Digital Pressure Sensor Datasheet," Bosch </w:t>
       </w:r>
       <w:proofErr w:type="spellStart"/>
       <w:r>
@@ -14537,7 +14607,7 @@
             </wp:inline>
           </w:drawing>
         </mc:Choice>
-        <mc:Fallback xmlns:oel="http://schemas.microsoft.com/office/2019/extlst" xmlns:w16du="http://schemas.microsoft.com/office/word/2023/wordml/word16du" xmlns:w16sdtfl="http://schemas.microsoft.com/office/word/2024/wordml/sdtformatlock">
+        <mc:Fallback xmlns:w16sdtfl="http://schemas.microsoft.com/office/word/2024/wordml/sdtformatlock" xmlns:w16du="http://schemas.microsoft.com/office/word/2023/wordml/word16du" xmlns:oel="http://schemas.microsoft.com/office/2019/extlst">
           <w:pict>
             <v:shapetype w14:anchorId="2D5379D4" id="_x0000_t110" coordsize="21600,21600" o:spt="110" path="m10800,l,10800,10800,21600,21600,10800xe">
               <v:stroke joinstyle="miter"/>

</xml_diff>